<commit_message>
court(cit) complaint: typst/latex/docx on the shared cross-engine layout model; XENG-001..003 pass on latex and docx, params.cross_engine: gate (fb-595.54.6)
</commit_message>
<xml_diff>
--- a/courts/federal-circuit/court-of-international-trade/complaint/docx/reference.docx
+++ b/courts/federal-circuit/court-of-international-trade/complaint/docx/reference.docx
@@ -314,10 +314,9 @@
       </w:r>
     </w:p>
     <w:sectPr>
-      <w:footerReference w:type="default" r:id="rIdCITFooter"/>
-      <w:footnotePr>
-        <w:numRestart w:val="eachSect"/>
-      </w:footnotePr>
+      <w:footerReference w:type="default" r:id="rIdFooter1"/>
+      <w:pgSz w:w="12240" w:h="15840"/>
+      <w:pgMar w:top="1440" w:right="1440" w:bottom="1440" w:left="1440" w:header="720" w:footer="728" w:gutter="0"/>
     </w:sectPr>
   </w:body>
 </w:document>
@@ -331,7 +330,7 @@
 <w:ftr xmlns:w="http://schemas.openxmlformats.org/wordprocessingml/2006/main" xmlns:r="http://schemas.openxmlformats.org/officeDocument/2006/relationships">
   <w:p>
     <w:pPr>
-      <w:spacing w:before="0" w:after="0" w:line="240" w:lineRule="auto"/>
+      <w:spacing w:before="0" w:after="0" w:line="280" w:lineRule="exact"/>
       <w:jc w:val="center"/>
     </w:pPr>
     <w:r>
@@ -512,15 +511,16 @@
   <w:docDefaults>
     <w:rPrDefault>
       <w:rPr>
-        <w:rFonts w:ascii="EB Garamond" w:hAnsi="EB Garamond" w:eastAsia="EB Garamond" w:cs="EB Garamond"/>
+        <w:rFonts w:ascii="Times New Roman" w:hAnsi="Times New Roman" w:eastAsia="Times New Roman" w:cs="Times New Roman"/>
         <w:sz w:val="24"/>
         <w:szCs w:val="24"/>
-        <w:lang w:val="en-US"/>
+        <w:lang w:val="en-US" w:eastAsia="zh-CN" w:bidi="ar-SA"/>
       </w:rPr>
     </w:rPrDefault>
     <w:pPrDefault>
       <w:pPr>
-        <w:spacing w:after="200"/>
+        <w:widowControl/>
+        <w:spacing w:after="0"/>
       </w:pPr>
     </w:pPrDefault>
   </w:docDefaults>
@@ -528,14 +528,6 @@
   <w:style w:type="paragraph" w:default="1" w:styleId="Normal">
     <w:name w:val="Normal"/>
     <w:qFormat/>
-    <w:pPr>
-      <w:spacing w:before="0" w:after="0" w:line="240" w:lineRule="auto"/>
-    </w:pPr>
-    <w:rPr>
-      <w:rFonts w:ascii="EB Garamond" w:hAnsi="EB Garamond" w:eastAsia="EB Garamond" w:cs="EB Garamond"/>
-      <w:sz w:val="24"/>
-      <w:szCs w:val="24"/>
-    </w:rPr>
   </w:style>
   <w:style w:type="paragraph" w:styleId="BodyText">
     <w:name w:val="Body Text"/>
@@ -543,12 +535,8 @@
     <w:link w:val="BodyTextChar"/>
     <w:qFormat/>
     <w:pPr>
-      <w:tabs>
-        <w:tab w:val="left" w:pos="1584"/>
-      </w:tabs>
       <w:spacing w:before="0" w:after="0" w:line="480" w:lineRule="exact"/>
       <w:ind w:firstLine="720"/>
-      <w:jc w:val="left"/>
     </w:pPr>
   </w:style>
   <w:style w:type="paragraph" w:customStyle="1" w:styleId="FirstParagraph">
@@ -556,22 +544,13 @@
     <w:basedOn w:val="BodyText"/>
     <w:next w:val="BodyText"/>
     <w:qFormat/>
-    <w:pPr>
-      <w:tabs>
-        <w:tab w:val="left" w:pos="1584"/>
-      </w:tabs>
-      <w:spacing w:before="0" w:after="0" w:line="480" w:lineRule="exact"/>
-      <w:ind w:firstLine="720"/>
-      <w:jc w:val="left"/>
-    </w:pPr>
   </w:style>
   <w:style w:type="paragraph" w:customStyle="1" w:styleId="Compact">
     <w:name w:val="Compact"/>
     <w:basedOn w:val="BodyText"/>
     <w:qFormat/>
     <w:pPr>
-      <w:spacing w:before="0" w:after="0" w:line="480" w:lineRule="exact"/>
-      <w:jc w:val="left"/>
+      <w:spacing w:before="36" w:after="36"/>
     </w:pPr>
   </w:style>
   <w:style w:type="paragraph" w:styleId="Title">
@@ -718,13 +697,17 @@
     <w:pPr>
       <w:keepNext/>
       <w:keepLines/>
-      <w:spacing w:before="240" w:after="240" w:line="240" w:lineRule="auto"/>
+      <w:spacing w:before="240" w:after="0" w:line="480" w:lineRule="exact"/>
+      <w:ind w:firstLine="0"/>
       <w:jc w:val="center"/>
-    </w:pPr>
-    <w:rPr>
-      <w:rFonts w:ascii="EB Garamond" w:hAnsi="EB Garamond" w:eastAsia="EB Garamond" w:cs="EB Garamond"/>
+      <w:outlineLvl w:val="0"/>
+    </w:pPr>
+    <w:rPr>
+      <w:rFonts w:ascii="Times New Roman" w:hAnsi="Times New Roman" w:eastAsia="Times New Roman" w:cs="Times New Roman"/>
       <w:b/>
+      <w:bCs/>
       <w:caps/>
+      <w:color w:val="000000"/>
       <w:sz w:val="24"/>
       <w:szCs w:val="24"/>
     </w:rPr>
@@ -742,12 +725,15 @@
     <w:pPr>
       <w:keepNext/>
       <w:keepLines/>
-      <w:spacing w:before="240" w:after="240" w:line="240" w:lineRule="auto"/>
-      <w:jc w:val="center"/>
-    </w:pPr>
-    <w:rPr>
-      <w:rFonts w:ascii="EB Garamond" w:hAnsi="EB Garamond" w:eastAsia="EB Garamond" w:cs="EB Garamond"/>
+      <w:spacing w:before="240" w:after="0" w:line="480" w:lineRule="exact"/>
+      <w:ind w:firstLine="0"/>
+      <w:outlineLvl w:val="1"/>
+    </w:pPr>
+    <w:rPr>
+      <w:rFonts w:ascii="Times New Roman" w:hAnsi="Times New Roman" w:eastAsia="Times New Roman" w:cs="Times New Roman"/>
       <w:b/>
+      <w:bCs/>
+      <w:color w:val="000000"/>
       <w:sz w:val="24"/>
       <w:szCs w:val="24"/>
     </w:rPr>
@@ -765,13 +751,15 @@
     <w:pPr>
       <w:keepNext/>
       <w:keepLines/>
-      <w:spacing w:before="240" w:after="240" w:line="240" w:lineRule="auto"/>
-      <w:jc w:val="left"/>
-    </w:pPr>
-    <w:rPr>
-      <w:rFonts w:ascii="EB Garamond" w:hAnsi="EB Garamond" w:eastAsia="EB Garamond" w:cs="EB Garamond"/>
+      <w:spacing w:before="240" w:after="0" w:line="480" w:lineRule="exact"/>
+      <w:ind w:firstLine="0"/>
+      <w:outlineLvl w:val="2"/>
+    </w:pPr>
+    <w:rPr>
+      <w:rFonts w:ascii="Times New Roman" w:hAnsi="Times New Roman" w:eastAsia="Times New Roman" w:cs="Times New Roman"/>
       <w:b/>
-      <w:i/>
+      <w:bCs/>
+      <w:color w:val="000000"/>
       <w:sz w:val="24"/>
       <w:szCs w:val="24"/>
     </w:rPr>
@@ -789,13 +777,16 @@
     <w:pPr>
       <w:keepNext/>
       <w:keepLines/>
-      <w:spacing w:before="240" w:after="240" w:line="240" w:lineRule="auto"/>
-      <w:jc w:val="left"/>
-    </w:pPr>
-    <w:rPr>
-      <w:rFonts w:ascii="EB Garamond" w:hAnsi="EB Garamond" w:eastAsia="EB Garamond" w:cs="EB Garamond"/>
+      <w:spacing w:before="240" w:after="0" w:line="480" w:lineRule="exact"/>
+      <w:ind w:firstLine="0"/>
+      <w:outlineLvl w:val="3"/>
+    </w:pPr>
+    <w:rPr>
+      <w:rFonts w:ascii="Times New Roman" w:hAnsi="Times New Roman" w:eastAsia="Times New Roman" w:cs="Times New Roman"/>
       <w:b/>
+      <w:bCs/>
       <w:i/>
+      <w:color w:val="000000"/>
       <w:sz w:val="24"/>
       <w:szCs w:val="24"/>
     </w:rPr>
@@ -813,13 +804,16 @@
     <w:pPr>
       <w:keepNext/>
       <w:keepLines/>
-      <w:spacing w:before="240" w:after="240" w:line="240" w:lineRule="auto"/>
-      <w:jc w:val="left"/>
-    </w:pPr>
-    <w:rPr>
-      <w:rFonts w:ascii="EB Garamond" w:hAnsi="EB Garamond" w:eastAsia="EB Garamond" w:cs="EB Garamond"/>
+      <w:spacing w:before="240" w:after="0" w:line="480" w:lineRule="exact"/>
+      <w:ind w:firstLine="0"/>
+      <w:outlineLvl w:val="4"/>
+    </w:pPr>
+    <w:rPr>
+      <w:rFonts w:ascii="Times New Roman" w:hAnsi="Times New Roman" w:eastAsia="Times New Roman" w:cs="Times New Roman"/>
       <w:b/>
+      <w:bCs/>
       <w:i/>
+      <w:color w:val="000000"/>
       <w:sz w:val="24"/>
       <w:szCs w:val="24"/>
     </w:rPr>
@@ -1031,6 +1025,15 @@
       <w:color w:val="272727" w:themeColor="text1" w:themeTint="D8"/>
     </w:rPr>
   </w:style>
+  <w:style w:type="paragraph" w:customStyle="1" w:styleId="ListItem">
+    <w:name w:val="List Item"/>
+    <w:basedOn w:val="BodyText"/>
+    <w:qFormat/>
+    <w:pPr>
+      <w:spacing w:before="0" w:after="0" w:line="480" w:lineRule="exact"/>
+      <w:ind w:left="576" w:hanging="576"/>
+    </w:pPr>
+  </w:style>
   <w:style w:type="paragraph" w:styleId="BlockText">
     <w:name w:val="Block Text"/>
     <w:basedOn w:val="BodyText"/>
@@ -1039,8 +1042,8 @@
     <w:unhideWhenUsed/>
     <w:qFormat/>
     <w:pPr>
-      <w:spacing w:before="0" w:after="240" w:line="240" w:lineRule="auto"/>
-      <w:ind w:left="720" w:right="720" w:firstLine="0"/>
+      <w:spacing w:before="280" w:after="280" w:line="280" w:lineRule="exact"/>
+      <w:ind w:firstLine="0" w:left="720" w:right="720"/>
     </w:pPr>
   </w:style>
   <w:style w:type="paragraph" w:styleId="FootnoteText">
@@ -1051,7 +1054,8 @@
     <w:unhideWhenUsed/>
     <w:qFormat/>
     <w:pPr>
-      <w:spacing w:before="0" w:after="0" w:line="240" w:lineRule="auto"/>
+      <w:keepLines/>
+      <w:spacing w:before="0" w:after="140" w:line="280" w:lineRule="exact"/>
     </w:pPr>
     <w:rPr>
       <w:sz w:val="24"/>
@@ -1066,8 +1070,8 @@
     <w:unhideWhenUsed/>
     <w:qFormat/>
     <w:pPr>
-      <w:spacing w:before="100" w:after="100"/>
-      <w:ind w:firstLine="0" w:left="480" w:right="480"/>
+      <w:spacing w:before="280" w:after="280"/>
+      <w:ind w:firstLine="0" w:left="720" w:right="720"/>
     </w:pPr>
   </w:style>
   <w:style w:type="character" w:default="1" w:styleId="DefaultParagraphFont">
@@ -1175,7 +1179,7 @@
     <w:name w:val="Hyperlink"/>
     <w:basedOn w:val="BodyTextChar"/>
     <w:rPr>
-      <w:color w:val="4F81BD" w:themeColor="accent1"/>
+      <w:color w:val="000000"/>
     </w:rPr>
   </w:style>
   <w:style w:type="paragraph" w:styleId="TOCHeading">
@@ -1195,28 +1199,6 @@
       <w:bCs w:val="0"/>
       <w:color w:val="365F91" w:themeColor="accent1" w:themeShade="BF"/>
     </w:rPr>
-  </w:style>
-  <w:style w:type="paragraph" w:customStyle="1" w:styleId="CITItem">
-    <w:name w:val="CIT Item"/>
-    <w:basedOn w:val="Normal"/>
-    <w:qFormat/>
-    <w:pPr>
-      <w:tabs>
-        <w:tab w:val="left" w:pos="1584"/>
-      </w:tabs>
-      <w:spacing w:before="0" w:after="0" w:line="480" w:lineRule="exact"/>
-      <w:ind w:left="1296" w:hanging="576"/>
-      <w:jc w:val="left"/>
-    </w:pPr>
-  </w:style>
-  <w:style w:type="paragraph" w:customStyle="1" w:styleId="CITSingle">
-    <w:name w:val="CIT Single"/>
-    <w:basedOn w:val="Normal"/>
-    <w:qFormat/>
-    <w:pPr>
-      <w:spacing w:before="0" w:after="0" w:line="240" w:lineRule="auto"/>
-      <w:jc w:val="left"/>
-    </w:pPr>
   </w:style>
 </w:styles>
 </file>

</xml_diff>